<commit_message>
Fix oversized headers/footers in md2docx template
Remove extra empty paragraphs from header and footer XML in
template.docx that were causing Word to expand those regions.

Co-Authored-By: Claude Opus 4.6 (1M context) <noreply@anthropic.com>
</commit_message>
<xml_diff>
--- a/md2docx/assets/template.docx
+++ b/md2docx/assets/template.docx
@@ -341,9 +341,6 @@
       <w:pStyle w:val="Footer"/>
     </w:pPr>
   </w:p>
-  <w:p/>
-  <w:p/>
-  <w:p/>
 </w:ftr>
 </file>
 
@@ -391,14 +388,6 @@
       </w:p>
     </w:sdtContent>
   </w:sdt>
-  <w:p>
-    <w:pPr>
-      <w:pStyle w:val="Footer"/>
-    </w:pPr>
-  </w:p>
-  <w:p/>
-  <w:p/>
-  <w:p/>
 </w:ftr>
 </file>
 
@@ -452,9 +441,6 @@
       <w:pStyle w:val="Header"/>
     </w:pPr>
   </w:p>
-  <w:p/>
-  <w:p/>
-  <w:p/>
 </w:hdr>
 </file>
 
@@ -545,9 +531,6 @@
       </w:drawing>
     </w:r>
   </w:p>
-  <w:p/>
-  <w:p/>
-  <w:p/>
 </w:hdr>
 </file>
 

</xml_diff>